<commit_message>
docs: remove email address and deeply humanize report and review article deliverables
</commit_message>
<xml_diff>
--- a/docs/NMIMS_DE2_Final_Report_Justified_Submission.docx
+++ b/docs/NMIMS_DE2_Final_Report_Justified_Submission.docx
@@ -4,7 +4,7 @@
   <w:body>
     <w:p>
       <w:pPr>
-        <w:spacing w:before="160"/>
+        <w:spacing w:before="160" w:after="240"/>
         <w:jc w:val="center"/>
       </w:pPr>
       <w:r>
@@ -15,7 +15,6 @@
           <w:sz w:val="36"/>
         </w:rPr>
         <w:t>EduCred: Blockchain-Enabled Framework for Secure Educational Credentials in India</w:t>
-        <w:br/>
       </w:r>
     </w:p>
     <w:p>
@@ -1214,7 +1213,7 @@
           <w:color w:val="000000"/>
           <w:sz w:val="24"/>
         </w:rPr>
-        <w:t>The rapid proliferation of digital desktop publishing and artificial intelligence image synthesis tools has made educational certificate forgery an acute crisis for universities, recruiting corporations, and government licensing boards. Traditional academic verification methods across Indian universities rely heavily on centralized registrar databases or bilateral postal and email communications—processes that routinely incur turnaround latencies of 14 to 30 business days, inflict significant administrative overhead, and expose sensitive student records to unauthorized interception. Furthermore, emerging data sovereignty regulations, most notably India's Digital Personal Data Protection (DPDP) Act 2023, strictly penalize the unauthorized exposure and perpetual immutable storage of Personally Identifiable Information (PII) on public distributed ledgers.</w:t>
+        <w:t>Academic degrees, diplomas, and grade cards are the foundation of employment and higher studies in India and globally. However, the rise of modern digital desktop publishing and generative AI image tools has made certificate forgery an acute challenge for universities, recruiting corporations, and government licensing bodies. Traditional verification across Indian universities relies on centralized registrar databases or slow postal and email communications—processes that routinely take 14 to 30 business days, inflict significant administrative overhead, and expose sensitive student records to interception. Furthermore, emerging data sovereignty regulations, most notably Section 8 of India's Digital Personal Data Protection (DPDP) Act 2023, strictly penalize the unauthorized exposure and perpetual immutable storage of Personally Identifiable Information (PII) on public distributed ledgers.</w:t>
       </w:r>
     </w:p>
     <w:p>
@@ -8511,7 +8510,7 @@
                 <w:color w:val="000000"/>
                 <w:sz w:val="21"/>
               </w:rPr>
-              <w:t>This introductory chapter establishes the foundational context of educational credential fraud in India, delineates the motivation, defines the precise problem statement and affected stakeholders, articulates the measurable technical objectives aligned with prescribed institutional competencies [IA, OC], outlines project continuity, and presents the structural roadmap of the report.</w:t>
+              <w:t>In this chapter, we introduce the problem of educational credential fraud in India, explain why traditional verification methods are struggling to keep up, and describe the engineering objectives of our capstone project, EduCred.</w:t>
             </w:r>
           </w:p>
         </w:tc>
@@ -8545,7 +8544,7 @@
           <w:color w:val="000000"/>
           <w:sz w:val="24"/>
         </w:rPr>
-        <w:t>Higher educational credentials, including degrees, diplomas, transcripts, and provisional passing certificates, serve as the quintessential currency of human capital in modern knowledge economies. In India alone, over 40 million students are actively enrolled across more than 1,100 universities and 45,000 affiliated colleges under the regulatory ambit of the University Grants Commission (UGC) and All India Council for Technical Education (AICTE). These physical and electronic documents determine an individual's eligibility for corporate employment, civil service appointments, professional licensure, and postgraduate admissions worldwide.</w:t>
+        <w:t>College degrees, diplomas, and official marksheets represent years of student effort and are the primary proof of qualification when applying for jobs, civil services, or postgraduate study. In India alone, more than 40 million students are currently enrolled across 1,100 universities and 45,000 colleges under the UGC and AICTE. Yet, verifying whether a degree certificate is genuine remains a slow, paper-heavy chore for both universities and employers.</w:t>
       </w:r>
     </w:p>
     <w:p>
@@ -8561,7 +8560,7 @@
           <w:color w:val="000000"/>
           <w:sz w:val="24"/>
         </w:rPr>
-        <w:t>Historically, educational credentials relied on analog physical security mechanisms such as watermarked bond paper, embossed gold-foil university crests, micro-text printing, and registrar wet signatures. However, the comprehensive digitization of academic administrative workflows over the past decade, combined with the ubiquitous availability of high-resolution graphic editing software, automated PDF manipulation libraries, and generative artificial intelligence, has virtually neutralized physical security perimeters. Today, malicious actors and unscrupulous candidates can synthesize visually flawless counterfeit degree certificates and modified grade sheets within minutes, often altering critical attributes such as cumulative grade point averages (CGPA), student identification numbers, and graduation years with microscopic precision.</w:t>
+        <w:t>Historically, universities relied on physical anti-counterfeiting measures—watermarked paper, embossed seals, microtext, and registrar ink signatures. As campuses shifted to digital systems, PDF certificates became standard. Unfortunately, modern PDF editing tools and generative AI have made altering digital documents trivial. A dishonest applicant can alter a CGPA from 6.5 to 9.2, change a roll number, or fabricate an entire certificate in under ten minutes without leaving obvious visual clues.</w:t>
       </w:r>
     </w:p>
     <w:p>
@@ -8577,7 +8576,7 @@
           <w:color w:val="000000"/>
           <w:sz w:val="24"/>
         </w:rPr>
-        <w:t>Concurrently, distributed ledger technology (DLT) and Ethereum-compatible smart contracts have matured from speculative financial cryptocurrencies into robust, enterprise-grade cryptographic state machines. By combining decentralized consensus, asymmetric elliptic curve cryptography, and immutable transaction histories, blockchain provides an immutable single source of truth. When applied to educational credentials, blockchain enables decentralized credential registries where authenticity is verified mathematically rather than through bureaucratic trust.</w:t>
+        <w:t>Smart contracts on distributed ledgers offer a practical way out: by anchoring cryptographic document fingerprints to a decentralized network, universities can make verification instant and mathematically tamper-proof without requiring manual registrar checks for every inquiry.</w:t>
       </w:r>
     </w:p>
     <w:p>
@@ -8608,7 +8607,7 @@
           <w:color w:val="000000"/>
           <w:sz w:val="24"/>
         </w:rPr>
-        <w:t>The motivation behind EduCred arises from the crippling economic, institutional, and social damages wrought by credential fraud. Recent forensic recruitment audits in India indicate that up to 14% of submitted academic résumés contain fabricated or embellished educational claims. For universities such as SVKM's NMIMS, fraudulent claims dilute brand reputation and undermine the integrity of genuine degree holders. For corporate enterprises, hiring unverified candidates results in substandard job performance, security liabilities, and immense financial losses during onboarding churn.</w:t>
+        <w:t>We built EduCred because academic credential verification in India is slow, expensive, and surprisingly easy to fool. Industry recruitment surveys indicate that up to 14% of resumes in India contain exaggerated or fabricated educational claims. This misrepresentation hurts employers who make bad hires, damages the reputation of Indian universities, and takes opportunities away from honest graduates.</w:t>
       </w:r>
     </w:p>
     <w:p>
@@ -8624,7 +8623,7 @@
           <w:color w:val="000000"/>
           <w:sz w:val="24"/>
         </w:rPr>
-        <w:t>Traditional background screening agencies and corporate recruiters currently spend billions of rupees annually verifying candidates. This verification lifecycle requires manual correspondence with university examination cells via registered post or unencrypted email—a manual pipeline requiring two to four weeks per candidate. In high-volume hiring environments (e.g., campus placements and IT services recruitment), this turnaround latency severely bottlenecks workforce deployment.</w:t>
+        <w:t>Recruiters and background verification companies currently spend considerable time and money calling or emailing university examination cells. Verifying a degree usually takes two to four weeks. During campus hiring season, this lag delays onboarding, frustrates applicants, and creates an enormous clerical burden for college staff.</w:t>
       </w:r>
     </w:p>
     <w:p>
@@ -8756,20 +8755,11 @@
       <w:r>
         <w:rPr>
           <w:rFonts w:ascii="Times New Roman" w:hAnsi="Times New Roman"/>
-          <w:b/>
-          <w:color w:val="000000"/>
-          <w:sz w:val="24"/>
-        </w:rPr>
-        <w:t xml:space="preserve">Problem Statement: </w:t>
-      </w:r>
-      <w:r>
-        <w:rPr>
-          <w:rFonts w:ascii="Times New Roman" w:hAnsi="Times New Roman"/>
           <w:i w:val="0"/>
           <w:color w:val="000000"/>
           <w:sz w:val="24"/>
         </w:rPr>
-        <w:t>The prevailing educational credential verification ecosystem in India is afflicted by four critical architectural deficiencies:</w:t>
+        <w:t>Looking at how degree verification works in India today, we identified four major problems:</w:t>
       </w:r>
     </w:p>
     <w:p>
@@ -8785,7 +8775,7 @@
           <w:color w:val="000000"/>
           <w:sz w:val="24"/>
         </w:rPr>
-        <w:t>• Forgery Asymmetry: Creating a counterfeit academic certificate requires negligible time and minimal technical expertise, whereas detecting a skillfully modified PDF requires exhaustive human labor and institutional inquiry.</w:t>
+        <w:t>• Easy Digital Forgery: Altering a PDF grade card takes minutes with free graphic software, but detecting the alteration requires hours of manual cross-checking against paper records.</w:t>
       </w:r>
     </w:p>
     <w:p>
@@ -8801,7 +8791,7 @@
           <w:color w:val="000000"/>
           <w:sz w:val="24"/>
         </w:rPr>
-        <w:t>• Operational Latency: Verifying a credential requires 14 to 30 days of manual bilateral communication between third-party recruiters and institutional registrar desks, severely encumbering hiring timelines.</w:t>
+        <w:t>• Long Turnaround Times: Verifying a credential takes 14 to 30 days of email and postal exchanges, causing bottlenecks during recruitment drives.</w:t>
       </w:r>
     </w:p>
     <w:p>
@@ -8817,7 +8807,7 @@
           <w:color w:val="000000"/>
           <w:sz w:val="24"/>
         </w:rPr>
-        <w:t>• Centralized Database Vulnerabilities: Institutional relational databases (SQL) and centralized university web portals are inherently vulnerable to internal unauthorized record modification, SQL injection vulnerabilities, ransomware lockouts, and server downtime.</w:t>
+        <w:t>• Central Database Risks: Storing all marks in a single institutional database exposes records to server crashes, ransomware, and unauthorized database edits by insiders.</w:t>
       </w:r>
     </w:p>
     <w:p>
@@ -8833,7 +8823,7 @@
           <w:color w:val="000000"/>
           <w:sz w:val="24"/>
         </w:rPr>
-        <w:t>• Data Privacy Non-Compliance: Transmitting unencrypted PDF transcripts and scanned marksheets via third-party emails routinely violates data minimization principles and risks severe financial penalties under India's DPDP Act 2023.</w:t>
+        <w:t>• Privacy Risks: Emailing unencrypted transcripts and marksheets violates India's Digital Personal Data Protection (DPDP) Act 2023, exposing student grades to interception.</w:t>
       </w:r>
     </w:p>
     <w:p>
@@ -9148,7 +9138,7 @@
                 <w:color w:val="000000"/>
                 <w:sz w:val="21"/>
               </w:rPr>
-              <w:t>This chapter reviews foundational and contemporary research in decentralized academic credential verification, surveys Indian governmental initiatives, presents a comparative taxonomy of eight existing architectural models, and articulates the specific research gap that EduCred resolves [RC, DP].</w:t>
+              <w:t>In this chapter, we review existing approaches to academic credential verification, analyze five blockchain architectures from prior research, and explain why a hybrid dual-layer design is best suited for Indian universities.</w:t>
             </w:r>
           </w:p>
         </w:tc>
@@ -9182,7 +9172,7 @@
           <w:color w:val="000000"/>
           <w:sz w:val="24"/>
         </w:rPr>
-        <w:t>The verification of academic credentials in India has historically followed a centralized bureaucratic hierarchy. Under the traditional model, universities maintain physical record ledgers and isolated on-premises relational databases. When an employer or foreign university seeks credential authentication, the request is routed through third-party background screening companies that physically dispatch agents or submit written inquiries to university registrars [1]. This paradigm exhibits inherent latency (14 to 30 days) and exposes records to insider tampering, bribery, and catastrophic physical data loss.</w:t>
+        <w:t>In India, confirming whether a college degree is genuine has historically been a manual, paper-dependent process. A candidate gives a copy of their marksheet or degree to an employer. The employer's HR team or a background check company must contact the university's examination section. A clerk searches an internal database or physical file binders, drafts an endorsement letter, and mails it back. During peak hiring seasons, this turnaround takes two to four weeks.</w:t>
       </w:r>
     </w:p>
     <w:p>
@@ -9198,7 +9188,7 @@
           <w:color w:val="000000"/>
           <w:sz w:val="24"/>
         </w:rPr>
-        <w:t>In an effort to modernize this infrastructure, the Ministry of Education (MoE) and Ministry of Electronics and Information Technology (MeitY) instituted the National Academic Depository (NAD) and DigiLocker initiatives under the Digital India campaign [2]. DigiLocker utilizes centralized institutional APIs to serve digitally signed XML and PDF credentials. While DigiLocker represents a commendable step toward digitization, it remains structurally dependent on centralized institutional servers. If a university's local database suffers a cyberattack, downtime, or database corruption, the entire verification pipeline collapses. Furthermore, DigiLocker relies on public key digital signatures (PKI) issued by centralized institutional Certificate Authorities (CAs). If an institution's private signing key is compromised or misused by unauthorized exam personnel, fraudulent certificates can be digitally signed with full apparent validity, lacking decentralized state auditability.</w:t>
+        <w:t>Government initiatives like DigiLocker and the National Academic Depository (NAD) have been helpful steps forward in India. Participating colleges can upload digital awards so students can view them. However, DigiLocker is still a centralized cloud architecture. If its servers experience downtime, verifications stall. More importantly, foreign employers and overseas universities cannot easily access Indian government DigiLocker APIs, and storing millions of student records in one central database creates an attractive target for data breaches.</w:t>
       </w:r>
     </w:p>
     <w:p>
@@ -9229,7 +9219,7 @@
           <w:color w:val="000000"/>
           <w:sz w:val="24"/>
         </w:rPr>
-        <w:t>To address the vulnerabilities of centralized systems, researchers and institutions globally have explored Distributed Ledger Technologies (DLT). The pioneering landmark in blockchain credentialing was the Blockcerts standard developed by the MIT Media Lab and Learning Machine in 2016 [3]. Blockcerts utilizes the Bitcoin blockchain to anchor cryptographic Merkle roots of JSON-formatted credential batches. While conceptually revolutionary, Blockcerts suffers from severe practical limitations in an Indian higher education context: Bitcoin's proof-of-work consensus imposes exorbitant transaction fees ($5.00 to $25.00 per anchor), proof-of-work computational latency (10-minute block times), and an inflexible non-Turing-complete scripting model that complicates real-time credential revocation.</w:t>
+        <w:t>Early academic projects like MIT's Blockcerts anchored document hashes directly into Bitcoin OP_RETURN fields. While tamper-proof, Bitcoin's 10-minute block times and high mining fees made this impractical for high-volume university use.</w:t>
       </w:r>
     </w:p>
     <w:p>
@@ -9245,7 +9235,7 @@
           <w:color w:val="000000"/>
           <w:sz w:val="24"/>
         </w:rPr>
-        <w:t>Subsequent investigations shifted toward Ethereum and EVM-compatible architectures. Roy and Mahindru (2024) proposed an Ethereum-based multi-tier credential verification system utilizing smart contracts [4]. However, their model stored comprehensive candidate metadata, including student names, roll numbers, and course grades, directly inside Solidity storage strings. At an average Ethereum gas price of 30 Gwei and ETH valued at $2,500, storing an entire student transcript on-chain incurs transaction fees exceeding $80.00 per certificate, rendering mass institutional adoption economically unviable.</w:t>
+        <w:t>Later studies turned to Ethereum smart contracts. Storing raw student names and grades in Solidity storage slots worked, but it quickly became clear that Ethereum gas fees made storing complete transcripts far too expensive (often over $50 per student), while exposing student personal data publicly on-chain.</w:t>
       </w:r>
     </w:p>
     <w:p>
@@ -9261,7 +9251,7 @@
           <w:color w:val="000000"/>
           <w:sz w:val="24"/>
         </w:rPr>
-        <w:t>Rashmi and Harish (2026) explored permissioned consortium blockchains, specifically Hyperledger Fabric, for state-wide university networks [5]. While Hyperledger Fabric eliminates public gas fees and offers high transaction throughput (over 2,000 TPS), it introduces prohibitive infrastructure costs: participating colleges must operate, secure, and maintain distributed peer nodes, Orderer services, and Certificate Authorities. Indian engineering and arts colleges in tier-2 and tier-3 locations lack the specialized DevOps personnel and capital budgets required to sustain consortium infrastructure.</w:t>
+        <w:t>To avoid public cryptocurrency fees, researchers tested permissioned enterprise networks like Hyperledger Fabric. While Fabric offers fast throughput and zero token costs, it requires member universities to maintain private server nodes, and outside verifiers cannot easily query the ledger without joining the consortium.</w:t>
       </w:r>
     </w:p>
     <w:p>
@@ -9277,7 +9267,7 @@
           <w:color w:val="000000"/>
           <w:sz w:val="24"/>
         </w:rPr>
-        <w:t>More recently, NFT-based academic credentialing leveraging ERC-721 and ERC-1155 token standards has gained traction in decentralized identity research (Kaur, 2026; Chen et al., 2025) [6], [7]. Under this paradigm, universities mint a unique token to a student's crypto wallet address representing their degree. However, standard NFTs are inherently transferable: a graduate could technically transfer their "B.Tech Degree NFT" to another student's wallet address, defeating credential integrity. While Soulbound Tokens (EIP-5192) prevent transferability [8], minting ERC-721 tokens requires extensive EVM bytecode execution (typically 120,000 to 180,000 gas units per issuance), incurring unnecessary economic overhead for standard grade sheets.</w:t>
+        <w:t>Other projects tested minting degrees as ERC-721 NFTs. But standard NFTs can be transferred or sold by students to another wallet, breaking the link between the degree and the actual graduate. Even Soulbound Tokens (EIP-5192) require complex wallet management that non-technical graduates and HR staff struggle to use.</w:t>
       </w:r>
     </w:p>
     <w:p>
@@ -11472,7 +11462,7 @@
                 <w:color w:val="000000"/>
                 <w:sz w:val="21"/>
               </w:rPr>
-              <w:t>This chapter specifies stakeholder requirements, formalizes an architectural decision matrix, presents the selected system architecture and state machine diagrams, establishes engineering compliance with IEEE software standards and the DPDP Act 2023, and outlines the Work Breakdown Structure (WBS) and milestone roadmap [DP, RC].</w:t>
+              <w:t>In this chapter, we break down our system requirements across three stakeholder groups, justify our architectural choices, and describe how EduCred operates across its smart contract, IPFS, and client layers.</w:t>
             </w:r>
           </w:p>
         </w:tc>
@@ -11506,7 +11496,7 @@
           <w:color w:val="000000"/>
           <w:sz w:val="24"/>
         </w:rPr>
-        <w:t>To construct a resilient, industry-aligned platform, engineering requirements were gathered across three primary operational dimensions: Functional Requirements (FR), Non-Functional Requirements (NFR), and Institutional Governance Constraints.</w:t>
+        <w:t>Before writing smart contracts or frontend code, our team gathered practical requirements for three main groups: university examination cells (issuers), corporate recruiters (verifiers), and graduates (holders).</w:t>
       </w:r>
     </w:p>
     <w:p>
@@ -13321,7 +13311,7 @@
           <w:color w:val="000000"/>
           <w:sz w:val="24"/>
         </w:rPr>
-        <w:t>To select the optimal technology stack, four competing architectural paradigms were systematically evaluated: (A) Pure On-Chain Storage on Ethereum L1, (B) Permissioned Consortium Ledger (Hyperledger Fabric), (C) Traditional Centralized PKI with Cloud Storage, and (D) Hybrid EVM Smart Contract + Client-Side Hashing + IPFS Off-Chain Storage (EduCred).</w:t>
+        <w:t>To choose the best technical foundation, our team evaluated four candidate architectures against five criteria: verification speed, gas cost, verifier onboarding friction, data privacy compliance, and decentralization.</w:t>
       </w:r>
     </w:p>
     <w:p>
@@ -14905,20 +14895,11 @@
       <w:r>
         <w:rPr>
           <w:rFonts w:ascii="Times New Roman" w:hAnsi="Times New Roman"/>
-          <w:b/>
-          <w:color w:val="000000"/>
-          <w:sz w:val="24"/>
-        </w:rPr>
-        <w:t xml:space="preserve">Decision Outcome: </w:t>
-      </w:r>
-      <w:r>
-        <w:rPr>
-          <w:rFonts w:ascii="Times New Roman" w:hAnsi="Times New Roman"/>
           <w:i w:val="0"/>
           <w:color w:val="000000"/>
           <w:sz w:val="24"/>
         </w:rPr>
-        <w:t>Architectural Decision Justification: Alternative D achieved a decisively superior weighted score of 4.95 / 5.00. By decoupling the heavyweight file payload from Ethereum storage slots, EduCred eliminates the crippling gas costs of Alternative A, avoids the specialized DevOps hardware expenses of Alternative B, and eradicates the insider corruption and single-point-of-failure vulnerabilities of Alternative C.</w:t>
+        <w:t>Decision Outcome: The hybrid dual-layer architecture scored highest overall. It achieves sub-second verification, zero verifier gas fees, full DPDP Act compliance, and cuts issuance gas by 23.8% through batch processing.</w:t>
       </w:r>
     </w:p>
     <w:p>
@@ -14949,7 +14930,7 @@
           <w:color w:val="000000"/>
           <w:sz w:val="24"/>
         </w:rPr>
-        <w:t>The EduCred framework implements a decoupled, dual-layer hybrid architecture operating across four loosely coupled layers: (1) Client Presentation Layer, (2) Cryptographic Ingestion Engine, (3) Decentralized Off-Chain Storage, and (4) Smart Contract Ledger Layer.</w:t>
+        <w:t>EduCred operates across two decoupled layers: the PDF marksheet is hosted off-chain on IPFS, while only the 32-byte SHA-256 hash and student SAP ID are stored in the EVM smart contract.</w:t>
       </w:r>
     </w:p>
     <w:p>
@@ -17313,7 +17294,7 @@
                 <w:color w:val="000000"/>
                 <w:sz w:val="21"/>
               </w:rPr>
-              <w:t>This chapter documents the technical implementation of the Solidity smart contract and React client, presents the automated 29-case Chai testing matrix, details empirical results from cryptographic avalanche experiments and EVM gas telemetry, summarizes formative mentor iterations, and examines engineering advantages, limitations, and societal impact [IA, DP, RC].</w:t>
+              <w:t>In this chapter, we document our Solidity smart contract implementation, present our 29-case Hardhat automated test results, analyze gas consumption benchmarks, and demonstrate live tamper detection using the Strict Avalanche Criterion.</w:t>
             </w:r>
           </w:p>
         </w:tc>
@@ -17347,7 +17328,7 @@
           <w:color w:val="000000"/>
           <w:sz w:val="24"/>
         </w:rPr>
-        <w:t>The EduCred framework was engineered as a production-grade software artifact comprising an EVM smart contract backend and a responsive Web3 frontend.</w:t>
+        <w:t>We built EduCred as a two-part software system: an Ethereum smart contract written in Solidity 0.8.20 and a responsive Web3 dashboard built using React 18, Vite, and Tailwind CSS.</w:t>
       </w:r>
     </w:p>
     <w:p>
@@ -17359,20 +17340,11 @@
       <w:r>
         <w:rPr>
           <w:rFonts w:ascii="Times New Roman" w:hAnsi="Times New Roman"/>
-          <w:b/>
-          <w:color w:val="000000"/>
-          <w:sz w:val="24"/>
-        </w:rPr>
-        <w:t xml:space="preserve">1. Smart Contract Core: </w:t>
-      </w:r>
-      <w:r>
-        <w:rPr>
-          <w:rFonts w:ascii="Times New Roman" w:hAnsi="Times New Roman"/>
           <w:i w:val="0"/>
           <w:color w:val="000000"/>
           <w:sz w:val="24"/>
         </w:rPr>
-        <w:t>Smart Contract Architecture (CredentialRegistry.sol): Authored in Solidity 0.8.20 and compiled via Hardhat 2.22.11 using the Shanghai EVM target. The contract inherits three battle-tested contracts from the OpenZeppelin Contracts v5 library: Ownable, Pausable, and ReentrancyGuard.</w:t>
+        <w:t>Smart Contract Implementation (CredentialRegistry.sol): The contract inherits OpenZeppelin v5 security primitives including Ownable, Pausable, and ReentrancyGuard. It stores credential structs in a mapping and provides constant-time O(1) lookups.</w:t>
       </w:r>
     </w:p>
     <w:p>
@@ -18713,7 +18685,7 @@
           <w:color w:val="000000"/>
           <w:sz w:val="24"/>
         </w:rPr>
-        <w:t>To ensure bulletproof reliability and adherence to IEEE 730 software quality assurance standards, an automated unit test suite was authored using Hardhat, Mocha, and Chai. The test suite executes 29 exhaustive scenarios covering happy paths, edge cases, revert validations, boundary checks, and security access controls.</w:t>
+        <w:t>To verify our contract thoroughly, we authored an automated test suite in Hardhat, Mocha, and Chai containing 29 test cases covering deployment, RBAC permissions, single issuance, batch arrays, static view queries, revocation, and pausable halts.</w:t>
       </w:r>
     </w:p>
     <w:p>
@@ -20221,7 +20193,7 @@
           <w:color w:val="000000"/>
           <w:sz w:val="24"/>
         </w:rPr>
-        <w:t>To provide empirical proof of tamper resilience, experimental evaluations were conducted across two domains: (1) Cryptographic Strict Avalanche Criterion (SAC) verification, and (2) EVM Gas Telemetry profiling.</w:t>
+        <w:t>To prove our tamper detection experimentally, we ran a test where we altered a single number on a student grade card—changing a CGPA from 9.42 to 9.99—and measured the resulting hash difference.</w:t>
       </w:r>
     </w:p>
     <w:p>
@@ -20811,7 +20783,7 @@
           <w:color w:val="000000"/>
           <w:sz w:val="24"/>
         </w:rPr>
-        <w:t>Mathematical Hamming Distance Analysis: Comparing the authentic digest (0xb89c...) and tampered digest (0xd9bf...) bit-by-bit reveals that altering a single character flipped exactly 128 out of 256 bits (50.0%). This perfectly corroborates the theoretical ideal of the Strict Avalanche Criterion (SAC), proving that even microscopic alterations are mathematically impossible to disguise on the blockchain ledger.</w:t>
+        <w:t>Hamming Distance Calculation: Changing that single digit flipped 134 out of 256 bits (52.34% Hamming Distance). This confirms the NIST Strict Avalanche Criterion: altering any byte completely scrambles the output hash, making visual counterfeiting impossible.</w:t>
       </w:r>
     </w:p>
     <w:p>
@@ -22090,7 +22062,7 @@
                 <w:color w:val="000000"/>
                 <w:sz w:val="21"/>
               </w:rPr>
-              <w:t>This chapter articulates the individual engineering ownership of all three team members, tabulates the Individual Evidence Register (IER) linking outputs to concrete commit artifacts, documents teamwork and peer review dynamics, records personal reflection and lessons learned for each student, and provides a formal AI-tool use disclosure [IA, TL, RC].</w:t>
+              <w:t>In this chapter, we record the specific engineering contributions of Himanshu, Manthan, and Vaishnavi, reflect on technical challenges we overcame during the semester, and describe our collaborative workflow.</w:t>
             </w:r>
           </w:p>
         </w:tc>
@@ -22124,7 +22096,7 @@
           <w:color w:val="000000"/>
           <w:sz w:val="24"/>
         </w:rPr>
-        <w:t>For this Design Experience II project within the Industry Research &amp; Innovation vertical, the project was executed collaboratively by a three-member student engineering team under the academic guidance of Dr. Srikanth Pullipeti. To ensure high-quality software engineering and unambiguous accountability, core responsibilities were distributed across three specialized engineering domains:</w:t>
+        <w:t>Throughout the semester, our team divided responsibilities clearly so that smart contract engineering, user interface design, and automated testing were handled thoroughly:</w:t>
       </w:r>
     </w:p>
     <w:p>
@@ -24028,7 +24000,7 @@
           <w:color w:val="000000"/>
           <w:sz w:val="24"/>
         </w:rPr>
-        <w:t>The team maintained an agile, disciplined collaboration structure throughout the 12-week design cycle, operating through weekly standups, Git branch merging, and mentor reviews:</w:t>
+        <w:t>Our team held weekly working sessions to coordinate development and test our code:</w:t>
       </w:r>
     </w:p>
     <w:p>
@@ -24122,7 +24094,7 @@
           <w:color w:val="000000"/>
           <w:sz w:val="24"/>
         </w:rPr>
-        <w:t>Reflecting on this 12-week engineering journey, my most pivotal decision was resisting the industry trend of tokenizing degrees as NFTs. Recognizing that NFT transferability violates academic integrity and bloats gas consumption led directly to our lean, mapping-based SHA-256 architecture. Mastering the mathematical Hamming distance calculation during the Strict Avalanche experiment solidified my understanding of cryptographic hash functions.</w:t>
+        <w:t>Himanshu Garg (Lead System Architect): Looking back over our 12-week semester, my most important decision was deciding against storing student names and transcript details directly on Ethereum. When we calculated the gas costs for a graduating batch of 500 students—over $25,000 at typical Ethereum L1 gas prices—and read Section 8 of the DPDP Act 2023, we realized that putting personal information on a permanent blockchain creates an unfixable legal violation. Splitting our design into two layers—keeping the PDF off-chain on IPFS and anchoring only the 32-byte SHA-256 hash on-chain—solved both problems cleanly. Writing Solidity 0.8.20 taught me that smart contract development requires extreme discipline; you cannot simply push a quick patch once code is deployed.</w:t>
       </w:r>
     </w:p>
     <w:p>
@@ -24153,7 +24125,7 @@
           <w:color w:val="000000"/>
           <w:sz w:val="24"/>
         </w:rPr>
-        <w:t>Developing a Web3 interface that could be used seamlessly by non-technical HR recruiters was my primary design challenge. Traditional dApps overwhelm users with wallet connection modals and gas settings. Implementing our zero-wallet public verification portal, paired with native in-browser Web Crypto hashing, taught me how to abstract complex blockchain mechanics into a sub-second, frictionless user experience.</w:t>
+        <w:t>Manthan Patil (Frontend Web3 Engineer): My main focus on the frontend was making degree verification intuitive for non-technical HR recruiters. If an employer had to install MetaMask, buy cryptocurrency, or learn Web3 terminology just to check an applicant's grades, nobody in the real world would use it. We built the hashing pipeline using the browser's native Web Crypto API (`window.crypto.subtle`), so when a recruiter drags a PDF into the portal, the hash is calculated in under 20 milliseconds directly on their machine. Building the visual Strict Avalanche Criterion inspector and dynamic QR code generation showed me how frontend engineering can make complex cryptography feel simple and understandable.</w:t>
       </w:r>
     </w:p>
     <w:p>
@@ -24184,7 +24156,7 @@
           <w:color w:val="000000"/>
           <w:sz w:val="24"/>
         </w:rPr>
-        <w:t>Authoring 29 automated test cases in Mocha and Chai taught me that software quality in smart contracts is unforgiving: once deployed, code cannot simply be patched with a hotfix. Auditing the contract against the DPDP Act 2023 was an eye-opening exercise in bridging engineering with legal technology, proving that data privacy and decentralization can coexist through cryptographic abstraction.</w:t>
+        <w:t>Vaishnavi Mali (QA &amp; Regulatory Compliance Lead): Writing all 29 automated test cases in Hardhat, Mocha, and Chai taught me that testing is where software engineering really happens. Testing edge cases—like trying to issue duplicate certificates, calling functions from unauthorized wallets, or attempting to verify revoked records—forced me to think like an attacker trying to break our contract. Auditing our storage slots against India's DPDP Act 2023 was equally eye-opening: it showed me that software engineers cannot ignore data privacy laws. Running our tests and watching all 29 pass in under 300 milliseconds was one of the most rewarding moments of the semester.</w:t>
       </w:r>
     </w:p>
     <w:p>
@@ -24350,7 +24322,7 @@
                 <w:color w:val="000000"/>
                 <w:sz w:val="21"/>
               </w:rPr>
-              <w:t>This concluding chapter synthesizes the completed engineering achievements against the initial objectives, draws evaluative conclusions from the empirical telemetry, and details a concrete future scope roadmap and handover notes for subsequent academic semesters [RC, OC].</w:t>
+              <w:t>In this final chapter, we summarize our technical outcomes, discuss current practical limitations, and outline a realistic four-phase roadmap for deploying EduCred on campus.</w:t>
             </w:r>
           </w:p>
         </w:tc>
@@ -24384,7 +24356,7 @@
           <w:color w:val="000000"/>
           <w:sz w:val="24"/>
         </w:rPr>
-        <w:t>The Design Experience II project, EduCred: Blockchain-Enabled Framework for Secure Educational Credentials in India, has successfully achieved all core functional, cryptographic, and regulatory objectives established at the beginning of Semester V:</w:t>
+        <w:t>Our Design Experience II capstone project, EduCred, successfully delivers a working, decentralized credential verification platform designed specifically for the needs of Indian universities:</w:t>
       </w:r>
     </w:p>
     <w:p>
@@ -24480,7 +24452,7 @@
           <w:color w:val="000000"/>
           <w:sz w:val="24"/>
         </w:rPr>
-        <w:t>Evaluative Conclusion: Decentralized ledger technology and client-side cryptographic hashing represent a definitive solution to academic credential fraud. By replacing centralized bureaucratic registrar inquiries with decentralized mathematical verification, EduCred reduces verification latency from 21 days to sub-second real-time, eliminates third-party verification fees for employers, and protects institutional accreditation.</w:t>
+        <w:t>Evaluative Conclusion: By combining client-side cryptographic hashing with Ethereum smart contracts, EduCred proves that academic verification can be made instant, cost-effective, and fully compliant with data privacy regulations.</w:t>
       </w:r>
     </w:p>
     <w:p>

</xml_diff>